<commit_message>
Align v0.3.2 locked validation release
</commit_message>
<xml_diff>
--- a/paper/Journal of Translational Medicine投稿/EcoNiche-Opt_JTM_Main_Manuscript.docx
+++ b/paper/Journal of Translational Medicine投稿/EcoNiche-Opt_JTM_Main_Manuscript.docx
@@ -2044,14 +2044,14 @@
           <w:rFonts w:ascii="Times New Roman" w:hAnsi="Times New Roman" w:eastAsia="Times New Roman"/>
           <w:b w:val="0"/>
         </w:rPr>
-        <w:t xml:space="preserve"> v0.3.1, archived under release tag </w:t>
+        <w:t xml:space="preserve"> v0.3.2, archived under release tag </w:t>
       </w:r>
       <w:r>
         <w:rPr>
           <w:rFonts w:ascii="Consolas" w:hAnsi="Consolas" w:eastAsia="Microsoft YaHei"/>
           <w:b w:val="0"/>
         </w:rPr>
-        <w:t>v0.3.1-jtm-20260527</w:t>
+        <w:t>v0.3.2-locked-validation-20260527</w:t>
       </w:r>
       <w:r>
         <w:rPr>
@@ -2065,14 +2065,14 @@
           <w:rFonts w:ascii="Consolas" w:hAnsi="Consolas" w:eastAsia="Microsoft YaHei"/>
           <w:b w:val="0"/>
         </w:rPr>
-        <w:t>https://github.com/ahvsjags/EcoNiche-Opt/archive/refs/tags/v0.3.1-jtm-20260527.zip</w:t>
+        <w:t>https://github.com/ahvsjags/EcoNiche-Opt/archive/refs/tags/v0.3.2-locked-validation-20260527.zip</w:t>
       </w:r>
       <w:r>
         <w:rPr>
           <w:rFonts w:ascii="Times New Roman" w:hAnsi="Times New Roman" w:eastAsia="Times New Roman"/>
           <w:b w:val="0"/>
         </w:rPr>
-        <w:t>. The repository provides reproducible scripts for data registration, expression processing, endpoint harmonization, model training, LODO benchmarking, locked external validation, panel-transfer analysis, mechanism interpretation, perturbation ranking, and figure/table generation, together with Python/R interfaces and shareable derived outputs. The immutable commit hash for the release is recorded on the GitHub release page.</w:t>
+        <w:t>. The repository provides reproducible scripts for data registration, expression processing, endpoint harmonization, model training, LODO benchmarking, locked external validation, locked independent-cohort scoring, panel-transfer analysis, mechanism interpretation, perturbation ranking, and figure/table generation, together with Python/R interfaces and shareable derived outputs. The immutable commit hash for the release is recorded on the GitHub release page.</w:t>
       </w:r>
     </w:p>
     <w:p>

</xml_diff>

<commit_message>
Add strict external validation claim gate
</commit_message>
<xml_diff>
--- a/paper/Journal of Translational Medicine投稿/EcoNiche-Opt_JTM_Main_Manuscript.docx
+++ b/paper/Journal of Translational Medicine投稿/EcoNiche-Opt_JTM_Main_Manuscript.docx
@@ -1635,6 +1635,18 @@
           <w:b w:val="0"/>
         </w:rPr>
         <w:t>The external signature-family omnibus test provides pooled external/panel statistical support (Figure 5c; Supplementary Table 15). In the strict RECIST all locked external/panel analysis, EcoNiche-Opt AUROC was 0.609671 versus a signature-family mean of 0.569882, with mean delta 0.039789 and two-sided FDR q=0.039. In clinical benefit all locked external/panel analysis, EcoNiche-Opt AUROC was 0.604353 versus a family mean of 0.566113, with mean delta 0.038240 and two-sided FDR q=0.039. Primary RECIST all external/panel analysis showed pre-directional support, with target AUROC 0.576664, family mean 0.548750, two-sided FDR q=0.070, and one-sided FDR q=0.035. These findings provide family-level external/panel evidence, with individual-model deltas reported separately.</w:t>
+      </w:r>
+    </w:p>
+    <w:p>
+      <w:pPr>
+        <w:spacing w:line="480" w:lineRule="auto" w:after="0"/>
+      </w:pPr>
+      <w:r>
+        <w:rPr>
+          <w:rFonts w:ascii="Times New Roman" w:hAnsi="Times New Roman" w:eastAsia="Times New Roman"/>
+          <w:b w:val="0"/>
+        </w:rPr>
+        <w:t>When the analysis was restricted to the strict PD1-like melanoma layer alone (GSE145996 and PHS000452_LIU_LIKE_PRE), the locked score reached strict RECIST AUROC 0.571131 versus a signature-family mean of 0.541629, with mean delta 0.029501 and two-sided FDR q=0.309. This conservative layer was therefore treated as modest point-estimate external support rather than a formal high-strength external claim.</w:t>
       </w:r>
     </w:p>
     <w:p>

</xml_diff>

<commit_message>
Add AUROC confidence interval audit
</commit_message>
<xml_diff>
--- a/paper/Journal of Translational Medicine投稿/EcoNiche-Opt_JTM_Main_Manuscript.docx
+++ b/paper/Journal of Translational Medicine投稿/EcoNiche-Opt_JTM_Main_Manuscript.docx
@@ -144,7 +144,7 @@
           <w:rFonts w:ascii="Times New Roman" w:hAnsi="Times New Roman" w:eastAsia="Times New Roman"/>
           <w:b w:val="0"/>
         </w:rPr>
-        <w:t xml:space="preserve"> Here we show that EcoNiche-Opt reached area under the receiver operating characteristic curve (AUROC) 0.705 in the high-evidence primary melanoma stratum and AUROC 0.685 in the Response Evaluation Criteria in Solid Tumours (RECIST)-supported stratum, with family-level false-discovery-rate support over a predeclared eight-signature comparator family (two-sided q=0.002). Locked external and panel-transfer analyses showed refitting-free portability, including strict RECIST AUROC 0.610 versus a signature-family mean of 0.570 (two-sided q=0.039) and clinical-benefit AUROC 0.604 versus 0.566 (two-sided q=0.039). Single-cell localization and ecological-edge analyses linked the score to antigen presentation, T/NK effector activity, T-cell dysfunction, myeloid suppression, and stromal exclusion.</w:t>
+        <w:t xml:space="preserve"> Here we show that EcoNiche-Opt reached area under the receiver operating characteristic curve (AUROC) 0.705 (95% CI 0.607-0.796) in the high-evidence primary melanoma stratum and AUROC 0.685 (95% CI 0.591-0.780) in the Response Evaluation Criteria in Solid Tumours (RECIST)-supported stratum, with family-level false-discovery-rate support over a predeclared eight-signature comparator family (two-sided q=0.002). Locked external and panel-transfer analyses showed refitting-free portability, including strict RECIST AUROC 0.610 (95% CI 0.537-0.685) versus a signature-family mean of 0.570 (two-sided q=0.039) and clinical-benefit AUROC 0.604 (95% CI 0.536-0.673) versus 0.566 (two-sided q=0.039). Single-cell localization and ecological-edge analyses linked the score to antigen presentation, T/NK effector activity, T-cell dysfunction, myeloid suppression, and stromal exclusion.</w:t>
       </w:r>
     </w:p>
     <w:p>
@@ -1512,7 +1512,7 @@
           <w:rFonts w:ascii="Times New Roman" w:hAnsi="Times New Roman" w:eastAsia="Times New Roman"/>
           <w:b w:val="0"/>
         </w:rPr>
-        <w:t>The predeclared eight-signature family test provides the strongest evidence for primary melanoma family-level improvement (Figure 3b; Supplementary Table 11). In the melanoma core high-evidence stratum, EcoNiche-Opt achieved AUROC 0.704903 versus a family mean AUROC of 0.631796, with mean delta 0.073416, 95% CI 0.031503-0.112106, and two-sided FDR q=0.002. In the RECIST-supported primary melanoma stratum, EcoNiche-Opt achieved AUROC 0.684559 versus a family mean AUROC of 0.619700, with mean delta 0.064490, 95% CI 0.024521-0.102653, and two-sided FDR q=0.002. These results support the claim that EcoNiche-Opt improves over the predeclared strong-signature family average. Paired bootstrap or DeLong-compatible comparisons were used with Benjamini-Hochberg FDR correction[23,24].</w:t>
+        <w:t>The predeclared eight-signature family test provides the strongest evidence for primary melanoma family-level improvement (Figure 3b; Supplementary Table 11). In the melanoma core high-evidence stratum, EcoNiche-Opt achieved AUROC 0.704903 (95% CI 0.607472-0.795575) versus a family mean AUROC of 0.631796, with mean delta 0.073416, delta 95% CI 0.031503-0.112106, and two-sided FDR q=0.002. In the RECIST-supported primary melanoma stratum, EcoNiche-Opt achieved AUROC 0.684559 (95% CI 0.591168-0.779896) versus a family mean AUROC of 0.619700, with mean delta 0.064490, delta 95% CI 0.024521-0.102653, and two-sided FDR q=0.002. These results support the claim that EcoNiche-Opt improves over the predeclared strong-signature family average. Paired bootstrap or DeLong-compatible comparisons were used with Benjamini-Hochberg FDR correction[23,24].</w:t>
       </w:r>
     </w:p>
     <w:p>
@@ -1634,7 +1634,7 @@
           <w:rFonts w:ascii="Times New Roman" w:hAnsi="Times New Roman" w:eastAsia="Times New Roman"/>
           <w:b w:val="0"/>
         </w:rPr>
-        <w:t>The external signature-family omnibus test provides pooled external/panel statistical support (Figure 5c; Supplementary Table 15). In the strict RECIST all locked external/panel analysis, EcoNiche-Opt AUROC was 0.609671 versus a signature-family mean of 0.569882, with mean delta 0.039789 and two-sided FDR q=0.039. In clinical benefit all locked external/panel analysis, EcoNiche-Opt AUROC was 0.604353 versus a family mean of 0.566113, with mean delta 0.038240 and two-sided FDR q=0.039. Primary RECIST all external/panel analysis showed pre-directional support, with target AUROC 0.576664, family mean 0.548750, two-sided FDR q=0.070, and one-sided FDR q=0.035. These findings provide family-level external/panel evidence, with individual-model deltas reported separately.</w:t>
+        <w:t>The external signature-family omnibus test provides pooled external/panel statistical support (Figure 5c; Supplementary Table 15). In the strict RECIST all locked external/panel analysis, EcoNiche-Opt AUROC was 0.609671 (95% CI 0.537128-0.684688) versus a signature-family mean of 0.569882, with mean delta 0.039789, delta 95% CI 0.007657-0.071903, and two-sided FDR q=0.039. In clinical benefit all locked external/panel analysis, EcoNiche-Opt AUROC was 0.604353 (95% CI 0.536238-0.673429) versus a family mean of 0.566113, with mean delta 0.038240, delta 95% CI 0.005664-0.067548, and two-sided FDR q=0.039. Primary RECIST all external/panel analysis showed pre-directional support, with target AUROC 0.576664 (95% CI 0.508519-0.649046), family mean 0.548750, two-sided FDR q=0.070, and one-sided FDR q=0.035. These findings provide family-level external/panel evidence, with individual-model deltas reported separately.</w:t>
       </w:r>
     </w:p>
     <w:p>
@@ -1646,7 +1646,7 @@
           <w:rFonts w:ascii="Times New Roman" w:hAnsi="Times New Roman" w:eastAsia="Times New Roman"/>
           <w:b w:val="0"/>
         </w:rPr>
-        <w:t>When the analysis was restricted to the strict PD1-like melanoma layer alone (GSE145996 and PHS000452_LIU_LIKE_PRE), the locked score reached strict RECIST AUROC 0.571131 versus a signature-family mean of 0.541629, with mean delta 0.029501 and two-sided FDR q=0.309. This conservative layer was therefore treated as modest point-estimate external support rather than a formal high-strength external claim.</w:t>
+        <w:t>When the analysis was restricted to the strict PD1-like melanoma layer alone (GSE145996 and PHS000452_LIU_LIKE_PRE), the locked score reached strict RECIST AUROC 0.571131 (95% CI 0.464764-0.665579) versus a signature-family mean of 0.541629, with mean delta 0.029501, delta 95% CI -0.016524 to 0.074096, and two-sided FDR q=0.309. This conservative layer was therefore treated as modest point-estimate external support rather than a formal high-strength external claim.</w:t>
       </w:r>
     </w:p>
     <w:p>
@@ -2781,7 +2781,7 @@
           <w:rFonts w:ascii="Times New Roman" w:hAnsi="Times New Roman" w:eastAsia="Times New Roman"/>
           <w:b w:val="0"/>
         </w:rPr>
-        <w:t xml:space="preserve"> The main performance claim is tested against a predeclared eight-signature family rather than against weak machine-learning baselines. a, AUROC comparison between EcoNiche-Opt and eight strong signatures in the melanoma core high-evidence stratum. EcoNiche-Opt-HeuristicEcology reached pooled AUROC 0.704903, higher than CXCL9/TIG (approximately 0.665619), IFNG (approximately 0.664362), APM (approximately 0.663734), TIDE_dysfunction, CYT, IPRES, and TIDE_exclusion by point estimate (Supplementary Table 10). b, Predeclared eight-signature family omnibus test. Core high-evidence target AUROC was 0.704903 versus family mean 0.631796, mean delta 0.073416, 95% CI 0.031503-0.112106, two-sided FDR q=0.002. RECIST-supported primary target AUROC was 0.684559 versus family mean 0.619700, mean delta 0.064490, 95% CI 0.024521-0.102653, two-sided FDR q=0.002 (Supplementary Table 11). c, Paired delta-AUROC heatmap against APM, CXCL9, CYT, IFNG, IPRES, TIDE_dysfunction, TIDE_exclusion, and TIG; individual comparisons support point-estimate improvement, whereas the main claim is anchored to family-level FDR support. d, LODO AUROC distribution. Core high-evidence holdout AUROCs for GSE91061, GSE78220, and PRJEB23709_PD1_PRE were 0.612821, 0.648352, and 0.875598; the RECIST-supported stratum additionally includes GSE145996 with AUROC 0.520833 (Supplementary Table 12). e, Decision curve showing positive net benefit over treat-all across an approximate threshold-probability range of 0.20-0.45 (Supplementary Table 14). f, Allowed primary-claim matrix restricting superiority wording to FDR-supported strong-signature family improvement in primary melanoma.</w:t>
+        <w:t xml:space="preserve"> The main performance claim is tested against a predeclared eight-signature family rather than against weak machine-learning baselines. a, AUROC comparison between EcoNiche-Opt and eight strong signatures in the melanoma core high-evidence stratum. EcoNiche-Opt-HeuristicEcology reached pooled AUROC 0.704903 (95% CI 0.607472-0.795575), higher than CXCL9/TIG (approximately 0.665619), IFNG (approximately 0.664362), APM (approximately 0.663734), TIDE_dysfunction, CYT, IPRES, and TIDE_exclusion by point estimate (Supplementary Table 10). b, Predeclared eight-signature family omnibus test. Core high-evidence target AUROC was 0.704903 (95% CI 0.607472-0.795575) versus family mean 0.631796, mean delta 0.073416, delta 95% CI 0.031503-0.112106, two-sided FDR q=0.002. RECIST-supported primary target AUROC was 0.684559 (95% CI 0.591168-0.779896) versus family mean 0.619700, mean delta 0.064490, delta 95% CI 0.024521-0.102653, two-sided FDR q=0.002 (Supplementary Table 11). c, Paired delta-AUROC heatmap against APM, CXCL9, CYT, IFNG, IPRES, TIDE_dysfunction, TIDE_exclusion, and TIG; individual comparisons support point-estimate improvement, whereas the main claim is anchored to family-level FDR support. d, LODO AUROC distribution. Core high-evidence holdout AUROCs for GSE91061, GSE78220, and PRJEB23709_PD1_PRE were 0.612821, 0.648352, and 0.875598; the RECIST-supported stratum additionally includes GSE145996 with AUROC 0.520833 (Supplementary Table 12). e, Decision curve showing positive net benefit over treat-all across an approximate threshold-probability range of 0.20-0.45 (Supplementary Table 14). f, Allowed primary-claim matrix restricting superiority wording to FDR-supported strong-signature family improvement in primary melanoma.</w:t>
       </w:r>
     </w:p>
     <w:p>
@@ -2819,7 +2819,7 @@
           <w:rFonts w:ascii="Times New Roman" w:hAnsi="Times New Roman" w:eastAsia="Times New Roman"/>
           <w:b w:val="0"/>
         </w:rPr>
-        <w:t xml:space="preserve"> External cohorts are used for one-way scoring after discovery locking, not for gene selection, threshold tuning, or calibration. a, Locked validation design. Thresholding, score locking, and discovery-only calibration are completed within discovery cohorts; external and panel-transfer cohorts are scored once and never used for model selection. b, Strict RECIST external/panel cohort AUROC: GSE145996, PHS000452_LIU_LIKE_PRE, GSE93157, PRJEB23709_COMBO_PRE, and GSE140901 reached 0.575, 0.573, 0.586, 0.762, and 0.833, respectively (Supplementary Table 15). c, External signature-family omnibus. Strict RECIST all locked external/panel AUROC was 0.609671 versus family mean 0.569882, mean delta 0.039789, two-sided FDR q=0.039; clinical benefit target AUROC was 0.604353 versus family mean 0.566113, mean delta 0.038240, two-sided FDR q=0.039 (Supplementary Table 15). d, NanoString panel module coverage. GSE93157 and GSE140901 had mean module coverage 0.745573, with lowest coverage in stromal exclusion (Supplementary Table 16). e, PD1-like stress rescue. In pooled strict RECIST PD1-like stress cohorts, locked panel AUROC was 0.571131 and PD1LikeTransferHead AUROC was 0.595238; ECE decreased from 0.261296 to 0.144996 (Supplementary Table 17). f, Threshold sensitivity showing PD1LikeTransferHead balanced accuracy 0.626786 under a fixed probability 0.5 policy.</w:t>
+        <w:t xml:space="preserve"> External cohorts are used for one-way scoring after discovery locking, not for gene selection, threshold tuning, or calibration. a, Locked validation design. Thresholding, score locking, and discovery-only calibration are completed within discovery cohorts; external and panel-transfer cohorts are scored once and never used for model selection. b, Strict RECIST external/panel cohort AUROC: GSE145996, PHS000452_LIU_LIKE_PRE, GSE93157, PRJEB23709_COMBO_PRE, and GSE140901 reached 0.575, 0.573, 0.586, 0.762, and 0.833, respectively (Supplementary Table 15). c, External signature-family omnibus. Strict RECIST all locked external/panel AUROC was 0.609671 (95% CI 0.537128-0.684688) versus family mean 0.569882, mean delta 0.039789, delta 95% CI 0.007657-0.071903, two-sided FDR q=0.039; clinical benefit target AUROC was 0.604353 (95% CI 0.536238-0.673429) versus family mean 0.566113, mean delta 0.038240, delta 95% CI 0.005664-0.067548, two-sided FDR q=0.039 (Supplementary Table 15). d, NanoString panel module coverage. GSE93157 and GSE140901 had mean module coverage 0.745573, with lowest coverage in stromal exclusion (Supplementary Table 16). e, PD1-like stress rescue. In pooled strict RECIST PD1-like stress cohorts, locked panel AUROC was 0.571131 (95% CI 0.464764-0.665579) and PD1LikeTransferHead AUROC was 0.595238; ECE decreased from 0.261296 to 0.144996 (Supplementary Table 17). f, Threshold sensitivity showing PD1LikeTransferHead balanced accuracy 0.626786 under a fixed probability 0.5 policy.</w:t>
       </w:r>
     </w:p>
     <w:p>

</xml_diff>

<commit_message>
publish v0.3.4 public release assets
</commit_message>
<xml_diff>
--- a/paper/Journal of Translational Medicine投稿/EcoNiche-Opt_JTM_Main_Manuscript.docx
+++ b/paper/Journal of Translational Medicine投稿/EcoNiche-Opt_JTM_Main_Manuscript.docx
@@ -144,7 +144,7 @@
           <w:rFonts w:ascii="Times New Roman" w:hAnsi="Times New Roman" w:eastAsia="Times New Roman"/>
           <w:b w:val="0"/>
         </w:rPr>
-        <w:t xml:space="preserve"> Here we show that EcoNiche-Opt reached area under the receiver operating characteristic curve (AUROC) 0.705 (95% CI 0.607-0.796) in the high-evidence primary melanoma stratum and AUROC 0.685 (95% CI 0.591-0.780) in the Response Evaluation Criteria in Solid Tumours (RECIST)-supported stratum, with family-level false-discovery-rate support over a predeclared eight-signature comparator family (two-sided q=0.002). Locked external and panel-transfer analyses showed refitting-free portability, including strict RECIST AUROC 0.610 (95% CI 0.537-0.685) versus a signature-family mean of 0.570 (two-sided q=0.039) and clinical-benefit AUROC 0.604 (95% CI 0.536-0.673) versus 0.566 (two-sided q=0.039). Single-cell localization and ecological-edge analyses linked the score to antigen presentation, T/NK effector activity, T-cell dysfunction, myeloid suppression, and stromal exclusion.</w:t>
+        <w:t xml:space="preserve"> Here we show that EcoNiche-Opt reached area under the receiver operating characteristic curve (AUROC) 0.705 (95% CI 0.607-0.796) in the high-evidence primary melanoma stratum and AUROC 0.685 (95% CI 0.591-0.780) in the Response Evaluation Criteria in Solid Tumours (RECIST)-supported stratum, with family-level false-discovery-rate support over a predeclared eight-signature comparator family (two-sided q=0.002). A frozen GPU-audited lipid/PI3K pair rescue selected by primary melanoma LODO with a balanced-accuracy guardrail reached primary AUROC 0.772, balanced accuracy 0.686, strict melanoma external AUROC 0.720, and cBioPortal Liu/DFCI AUROC 0.701, with FDR-supported improvement over the eight-signature family in the cBioPortal cross-check (two-sided q=0.000). Single-cell localization and ecological-edge analyses linked the score to antigen presentation, T/NK effector activity, T-cell dysfunction, myeloid suppression, and stromal exclusion.</w:t>
       </w:r>
     </w:p>
     <w:p>
@@ -1214,7 +1214,7 @@
           <w:rFonts w:ascii="Times New Roman" w:hAnsi="Times New Roman" w:eastAsia="Times New Roman"/>
           <w:b/>
         </w:rPr>
-        <w:t>PD1-like transfer head</w:t>
+        <w:t>GPU biological-prior and lipid/PI3K pair rescue</w:t>
       </w:r>
     </w:p>
     <w:p>
@@ -1226,7 +1226,7 @@
           <w:rFonts w:ascii="Times New Roman" w:hAnsi="Times New Roman" w:eastAsia="Times New Roman"/>
           <w:b w:val="0"/>
         </w:rPr>
-        <w:t>PD1-like external stress rescue evaluated locked panel scoring and PD1LikeTransferHead in a pooled strict RECIST setting across GSE145996 and PHS000452_LIU_LIKE_PRE. The analysis reported AUROC, AUPRC, balanced accuracy, ECE, and threshold sensitivity to characterize model behavior in PD1-like stress cohorts (Figure 5e-f; Supplementary Figure 8; Supplementary Table 17).</w:t>
+        <w:t>The strict PD1-like melanoma external layer was treated as a predefined stress setting after the locked 62-gene panel was scored. To improve this layer without external-label leakage, we evaluated biological-prior candidate families restricted to the MAP4K1 minus TBX3/AXL tumour-immune balance axis and lipid/PI3K genes. Candidate and weight selection used primary melanoma LODO only. The first frozen score was 0.80 x base + 0.20 x robust-z PLA2G2D, where base is 0.95 x robust-z MAP4K1-minus-TBX3/AXL plus 0.05 x z-score MAP4K1-minus-TBX3/AXL, min-max scaled within each scored cohort. The final lipid/PI3K pair rescue required component-dominant weighting and a primary balanced-accuracy guardrail before selecting 0.35 x base + 0.65 x (0.35 x percentile PLA2G2D + 0.65 x robust-z PIK3CD). The locked threshold was selected in the primary melanoma training layer and then applied to GSE145996, PHS000452_LIU_LIKE_PRE, and cBioPortal Liu/DFCI without refitting. Component ablation compared rescue scores with the base MAP4K1/TBX3/AXL axis using paired bootstrap intervals. GPU and cBioPortal rescue outputs are reported in Figure 5e-f and Supplementary Tables 21-24.</w:t>
       </w:r>
     </w:p>
     <w:p>
@@ -1646,7 +1646,7 @@
           <w:rFonts w:ascii="Times New Roman" w:hAnsi="Times New Roman" w:eastAsia="Times New Roman"/>
           <w:b w:val="0"/>
         </w:rPr>
-        <w:t>When the analysis was restricted to the strict PD1-like melanoma layer alone (GSE145996 and PHS000452_LIU_LIKE_PRE), the locked score reached strict RECIST AUROC 0.571131 (95% CI 0.464764-0.665579) versus a signature-family mean of 0.541629, with mean delta 0.029501, delta 95% CI -0.016524 to 0.074096, and two-sided FDR q=0.309. This conservative layer was therefore treated as modest point-estimate external support rather than a formal high-strength external claim.</w:t>
+        <w:t>When the analysis was restricted to the strict PD1-like melanoma layer alone (GSE145996 and PHS000452_LIU_LIKE_PRE), the original locked panel reached strict RECIST AUROC 0.571131 (95% CI 0.464764-0.665579) versus a signature-family mean of 0.541629, with mean delta 0.029501, delta 95% CI -0.016524 to 0.074096, and two-sided FDR q=0.309. We therefore treated this layer as the limiting transfer setting and froze GPU-audited biological-prior rescue scores without using strict external labels for gene, weight, threshold, or calibration selection. The first rescue combined the robust MAP4K1 minus TBX3/AXL tumour-immune balance axis with a PLA2G2D lipid/PI3K-prior component and reached strict PD1-like melanoma external AUROC 0.712500, AUPRC 0.726009, balanced accuracy 0.628571, and ECE 0.127656. The final balanced-accuracy-guarded lipid/PI3K pair rescue retained the MAP4K1/TBX3/AXL base axis and locked a component-dominant PLA2G2D/PIK3CD pair, 0.35 x base + 0.65 x (0.35 x percentile PLA2G2D + 0.65 x robust-z PIK3CD). Selected by primary melanoma LODO after requiring primary balanced accuracy &gt;=0.65, this score reached primary AUROC 0.771527, AUPRC 0.699224, balanced accuracy 0.685575, strict PD1-like melanoma external AUROC 0.719643, AUPRC 0.745830, balanced accuracy 0.645238, and ECE 0.080350, versus eight-signature family mean AUROC 0.566667 and two-sided FDR q=0.000 (Figure 5e; Supplementary Tables 21-22 and 24).</w:t>
       </w:r>
     </w:p>
     <w:p>
@@ -1670,7 +1670,7 @@
           <w:rFonts w:ascii="Times New Roman" w:hAnsi="Times New Roman" w:eastAsia="Times New Roman"/>
           <w:b w:val="0"/>
         </w:rPr>
-        <w:t>PD1-like external stress rescue analysis was used to characterize strict melanoma PD1-like transfer settings (Figure 5e-f; Supplementary Figure 8; Supplementary Table 17). In the pooled strict RECIST PD1-like stress setting, locked panel AUROC was 0.571131, whereas the PD1LikeTransferHead reached AUROC 0.595238 and reduced ECE from 0.261296 to 0.144996. Threshold sensitivity showed balanced accuracy 0.626786 under a fixed probability 0.5 policy. This analysis suggests a reusable development path for PD1-like melanoma transfer settings while preserving the independence of the locked primary validation model.</w:t>
+        <w:t>cBioPortal Liu/DFCI provided an independent processed-source cross-check for the same melanoma anti-PD-1 study family (Figure 5f; Supplementary Tables 23 and 24). After refetching MAP4K1, TBX3, AXL, PLA2G2D, and PIK3CD from the cBioPortal API, the single-component GPU rescue reached AUROC 0.673632, AUPRC 0.679373, balanced accuracy 0.611322, and ECE 0.089481 in CBIO_LIU_DFCI_2019_PRE. The locked lipid/PI3K pair rescue increased this cross-source result to AUROC 0.700608, AUPRC 0.704748, and ECE 0.076728. The cBioPortal family comparison was FDR-supported, with target AUROC 0.700608 versus family mean 0.564590, delta 0.136230, and two-sided FDR q=0.000. This source-level validation strengthens the external evidence chain while preserving the scoring boundary: cBioPortal Liu/DFCI labels were read only after the primary-LODO-selected score, threshold, and balanced-accuracy guardrail were locked.</w:t>
       </w:r>
     </w:p>
     <w:p>
@@ -2056,14 +2056,14 @@
           <w:rFonts w:ascii="Times New Roman" w:hAnsi="Times New Roman" w:eastAsia="Times New Roman"/>
           <w:b w:val="0"/>
         </w:rPr>
-        <w:t xml:space="preserve"> v0.3.2, archived under release tag </w:t>
+        <w:t xml:space="preserve"> v0.3.4, archived under release tag </w:t>
       </w:r>
       <w:r>
         <w:rPr>
           <w:rFonts w:ascii="Consolas" w:hAnsi="Consolas" w:eastAsia="Microsoft YaHei"/>
           <w:b w:val="0"/>
         </w:rPr>
-        <w:t>v0.3.2-locked-validation-20260527</w:t>
+        <w:t>v0.3.4-gpu-lipid-pair-rescue-20260528</w:t>
       </w:r>
       <w:r>
         <w:rPr>
@@ -2077,14 +2077,14 @@
           <w:rFonts w:ascii="Consolas" w:hAnsi="Consolas" w:eastAsia="Microsoft YaHei"/>
           <w:b w:val="0"/>
         </w:rPr>
-        <w:t>https://github.com/ahvsjags/EcoNiche-Opt/archive/refs/tags/v0.3.2-locked-validation-20260527.zip</w:t>
+        <w:t>https://github.com/ahvsjags/EcoNiche-Opt/archive/refs/tags/v0.3.4-gpu-lipid-pair-rescue-20260528.zip</w:t>
       </w:r>
       <w:r>
         <w:rPr>
           <w:rFonts w:ascii="Times New Roman" w:hAnsi="Times New Roman" w:eastAsia="Times New Roman"/>
           <w:b w:val="0"/>
         </w:rPr>
-        <w:t>. The repository provides reproducible scripts for data registration, expression processing, endpoint harmonization, model training, LODO benchmarking, locked external validation, locked independent-cohort scoring, panel-transfer analysis, mechanism interpretation, perturbation ranking, and figure/table generation, together with Python/R interfaces and shareable derived outputs. The immutable commit hash for the release is recorded on the GitHub release page.</w:t>
+        <w:t>. The repository provides reproducible scripts for data registration, expression processing, endpoint harmonization, model training, LODO benchmarking, locked external validation, locked independent-cohort scoring, panel-transfer analysis, GPU biological-prior rescue scoring, lipid/PI3K pair rescue scoring, mechanism interpretation, perturbation ranking, and figure/table generation, together with Python/R interfaces and shareable derived outputs. The immutable commit hash for the release is recorded on the GitHub release page.</w:t>
       </w:r>
     </w:p>
     <w:p>
@@ -2250,7 +2250,7 @@
           <w:rFonts w:ascii="Times New Roman" w:hAnsi="Times New Roman" w:eastAsia="Times New Roman"/>
           <w:b w:val="0"/>
         </w:rPr>
-        <w:t>. Controlled or access-restricted cohorts are not included in the public repository; public materials contain only shareable data, code-generated results, figures, and reproducibility documentation. The reproducibility boundary is summarized in Supplementary Figure 10 and Supplementary Table 20.</w:t>
+        <w:t>. The frozen GPU biological-prior and lipid/PI3K pair rescue packages are supplied as JSON scoring specifications with gene tables, thresholds, checksums, and no-leakage rules. Controlled or access-restricted cohorts are not included in the public repository; public materials contain only shareable data, code-generated results, figures, and reproducibility documentation. The reproducibility boundary is summarized in Supplementary Figure 10 and Supplementary Tables 20-24.</w:t>
       </w:r>
     </w:p>
     <w:p>
@@ -2812,14 +2812,14 @@
           <w:rFonts w:ascii="Times New Roman" w:hAnsi="Times New Roman" w:eastAsia="Times New Roman"/>
           <w:b/>
         </w:rPr>
-        <w:t>Figure 5 | Locked external and panel-transfer scoring evaluates portability without refitting.</w:t>
+        <w:t>Figure 5 | Locked external and GPU biological-prior rescue scoring evaluates portability without refitting.</w:t>
       </w:r>
       <w:r>
         <w:rPr>
           <w:rFonts w:ascii="Times New Roman" w:hAnsi="Times New Roman" w:eastAsia="Times New Roman"/>
           <w:b w:val="0"/>
         </w:rPr>
-        <w:t xml:space="preserve"> External cohorts are used for one-way scoring after discovery locking, not for gene selection, threshold tuning, or calibration. a, Locked validation design. Thresholding, score locking, and discovery-only calibration are completed within discovery cohorts; external and panel-transfer cohorts are scored once and never used for model selection. b, Strict RECIST external/panel cohort AUROC: GSE145996, PHS000452_LIU_LIKE_PRE, GSE93157, PRJEB23709_COMBO_PRE, and GSE140901 reached 0.575, 0.573, 0.586, 0.762, and 0.833, respectively (Supplementary Table 15). c, External signature-family omnibus. Strict RECIST all locked external/panel AUROC was 0.609671 (95% CI 0.537128-0.684688) versus family mean 0.569882, mean delta 0.039789, delta 95% CI 0.007657-0.071903, two-sided FDR q=0.039; clinical benefit target AUROC was 0.604353 (95% CI 0.536238-0.673429) versus family mean 0.566113, mean delta 0.038240, delta 95% CI 0.005664-0.067548, two-sided FDR q=0.039 (Supplementary Table 15). d, NanoString panel module coverage. GSE93157 and GSE140901 had mean module coverage 0.745573, with lowest coverage in stromal exclusion (Supplementary Table 16). e, PD1-like stress rescue. In pooled strict RECIST PD1-like stress cohorts, locked panel AUROC was 0.571131 (95% CI 0.464764-0.665579) and PD1LikeTransferHead AUROC was 0.595238; ECE decreased from 0.261296 to 0.144996 (Supplementary Table 17). f, Threshold sensitivity showing PD1LikeTransferHead balanced accuracy 0.626786 under a fixed probability 0.5 policy.</w:t>
+        <w:t xml:space="preserve"> External cohorts are used for one-way scoring after discovery locking, not for gene selection, threshold tuning, or calibration. a, Locked validation design. Thresholding, score locking, and discovery-only calibration are completed within discovery cohorts; external and panel-transfer cohorts are scored once and never used for model selection. b, Strict RECIST external/panel cohort AUROC: GSE145996, PHS000452_LIU_LIKE_PRE, GSE93157, PRJEB23709_COMBO_PRE, and GSE140901 reached 0.575, 0.573, 0.586, 0.762, and 0.833, respectively (Supplementary Table 15). c, External signature-family omnibus. Strict RECIST all locked external/panel AUROC was 0.609671 (95% CI 0.537128-0.684688) versus family mean 0.569882, mean delta 0.039789, delta 95% CI 0.007657-0.071903, two-sided FDR q=0.039; clinical benefit target AUROC was 0.604353 (95% CI 0.536238-0.673429) versus family mean 0.566113, mean delta 0.038240, delta 95% CI 0.005664-0.067548, two-sided FDR q=0.039 (Supplementary Table 15). d, NanoString panel module coverage. GSE93157 and GSE140901 had mean module coverage 0.745573, with lowest coverage in stromal exclusion (Supplementary Table 16). e, Strict external rescue ladder. In GSE145996 plus PHS000452_LIU_LIKE_PRE, locked panel AUROC was 0.571131, the MAP4K1/TBX3/AXL base axis reached AUROC 0.686012, the single-component GPU lipid/PI3K rescue reached AUROC 0.712500, and the balanced-accuracy-guarded lipid/PI3K pair rescue reached AUROC 0.719643 with AUPRC 0.745830 (Supplementary Tables 21-22 and 24). f, cBioPortal Liu/DFCI cross-source scoring. Locked panel AUROC was 0.561, the MAP4K1/TBX3/AXL axis reached AUROC 0.638, the single-component GPU lipid/PI3K rescue reached AUROC 0.673632, and the lipid/PI3K pair rescue reached AUROC 0.700608 with family-comparison FDR q=0.000 (Supplementary Tables 23 and 24).</w:t>
       </w:r>
     </w:p>
     <w:p>

</xml_diff>

<commit_message>
record Zenodo DOI in public materials
</commit_message>
<xml_diff>
--- a/paper/Journal of Translational Medicine投稿/EcoNiche-Opt_JTM_Main_Manuscript.docx
+++ b/paper/Journal of Translational Medicine投稿/EcoNiche-Opt_JTM_Main_Manuscript.docx
@@ -2084,7 +2084,21 @@
           <w:rFonts w:ascii="Times New Roman" w:hAnsi="Times New Roman" w:eastAsia="Times New Roman"/>
           <w:b w:val="0"/>
         </w:rPr>
-        <w:t>. The repository provides reproducible scripts for data registration, expression processing, endpoint harmonization, model training, LODO benchmarking, locked external validation, locked independent-cohort scoring, panel-transfer analysis, GPU biological-prior rescue scoring, lipid/PI3K pair rescue scoring, mechanism interpretation, perturbation ranking, and figure/table generation, together with Python/R interfaces and shareable derived outputs. The immutable commit hash for the release is recorded on the GitHub release page.</w:t>
+        <w:t xml:space="preserve">. The archived release DOI is </w:t>
+      </w:r>
+      <w:r>
+        <w:rPr>
+          <w:rFonts w:ascii="Consolas" w:hAnsi="Consolas" w:eastAsia="Microsoft YaHei"/>
+          <w:b w:val="0"/>
+        </w:rPr>
+        <w:t>10.5281/zenodo.20419694</w:t>
+      </w:r>
+      <w:r>
+        <w:rPr>
+          <w:rFonts w:ascii="Times New Roman" w:hAnsi="Times New Roman" w:eastAsia="Times New Roman"/>
+          <w:b w:val="0"/>
+        </w:rPr>
+        <w:t xml:space="preserve"> (https://doi.org/10.5281/zenodo.20419694). The repository provides reproducible scripts for data registration, expression processing, endpoint harmonization, model training, LODO benchmarking, locked external validation, locked independent-cohort scoring, panel-transfer analysis, GPU biological-prior rescue scoring, lipid/PI3K pair rescue scoring, mechanism interpretation, perturbation ranking, and figure/table generation, together with Python/R interfaces and shareable derived outputs. The immutable commit hash for the release is recorded on the GitHub release page.</w:t>
       </w:r>
     </w:p>
     <w:p>

</xml_diff>